<commit_message>
Add screenshots to Lab 13 Step 4 (Cilium LB-IPAM)
Eight captures from a live run on 2026-09-27 on a fresh Cilium 1.20.1 kind
cluster with no MetalLB: the LoadBalancer pending with no speaker or controller
present, LB-IPAM allocating an address that still returns http_code=000, the
same address returning 200 once a CiliumL2AnnouncementPolicy exists, the ARP
reply proving the lease holder is the only node answering, the pool conflict
message, a Service matching no pool explaining itself only in .status.conditions,
the pool-selector edit revoking a live address in fourteen seconds, and BGP
absent until it is enabled.

MAC addresses, the revocation timing and the learned-table entries are updated
to the values visible in the new images.

Co-Authored-By: Claude Opus 5 <noreply@anthropic.com>
</commit_message>
<xml_diff>
--- a/day-2-stateful-storage-and-exposure/lab-13-metallb.docx
+++ b/day-2-stateful-storage-and-exposure/lab-13-metallb.docx
@@ -2632,7 +2632,7 @@
       </w:r>
     </w:p>
     <w:bookmarkEnd w:id="28"/>
-    <w:bookmarkStart w:id="38" w:name="Xb9a108fca86a05d9698dbbb8668aee9d96094e2"/>
+    <w:bookmarkStart w:id="62" w:name="Xb9a108fca86a05d9698dbbb8668aee9d96094e2"/>
     <w:p>
       <w:pPr>
         <w:pStyle w:val="Heading2"/>
@@ -2787,7 +2787,7 @@
         <w:t xml:space="preserve">.</w:t>
       </w:r>
     </w:p>
-    <w:bookmarkStart w:id="30" w:name="Xa52f17f1d5224046dacf9a71f8614e1a6b8bb25"/>
+    <w:bookmarkStart w:id="33" w:name="Xa52f17f1d5224046dacf9a71f8614e1a6b8bb25"/>
     <w:p>
       <w:pPr>
         <w:pStyle w:val="Heading3"/>
@@ -3335,6 +3335,53 @@
     </w:p>
     <w:p>
       <w:pPr>
+        <w:pStyle w:val="BodyText"/>
+      </w:pPr>
+      <w:r>
+        <w:drawing>
+          <wp:inline>
+            <wp:extent cx="5943600" cy="856418"/>
+            <wp:effectExtent b="0" l="0" r="0" t="0"/>
+            <wp:docPr descr="No speaker and no controller on the Cilium cluster, and a LoadBalancer Service sitting at pending with nothing to serve it" title="" id="31" name="Picture"/>
+            <a:graphic>
+              <a:graphicData uri="http://schemas.openxmlformats.org/drawingml/2006/picture">
+                <pic:pic>
+                  <pic:nvPicPr>
+                    <pic:cNvPr descr="../artifacts/lab-13/screenshots/04-pending-no-implementation.png" id="32" name="Picture"/>
+                    <pic:cNvPicPr>
+                      <a:picLocks noChangeArrowheads="1" noChangeAspect="1"/>
+                    </pic:cNvPicPr>
+                  </pic:nvPicPr>
+                  <pic:blipFill>
+                    <a:blip r:embed="rId30"/>
+                    <a:stretch>
+                      <a:fillRect/>
+                    </a:stretch>
+                  </pic:blipFill>
+                  <pic:spPr bwMode="auto">
+                    <a:xfrm>
+                      <a:off x="0" y="0"/>
+                      <a:ext cx="5943600" cy="856418"/>
+                    </a:xfrm>
+                    <a:prstGeom prst="rect">
+                      <a:avLst/>
+                    </a:prstGeom>
+                    <a:noFill/>
+                    <a:ln w="9525">
+                      <a:noFill/>
+                      <a:headEnd/>
+                      <a:tailEnd/>
+                    </a:ln>
+                  </pic:spPr>
+                </pic:pic>
+              </a:graphicData>
+            </a:graphic>
+          </wp:inline>
+        </w:drawing>
+      </w:r>
+    </w:p>
+    <w:p>
+      <w:pPr>
         <w:pStyle w:val="BlockText"/>
       </w:pPr>
       <w:r>
@@ -3597,8 +3644,8 @@
         <w:t xml:space="preserve"># apiGroups: ['coordination.k8s.io'] resources: ['leases'] verbs: ['create','get','update','list','delete']</w:t>
       </w:r>
     </w:p>
-    <w:bookmarkEnd w:id="30"/>
-    <w:bookmarkStart w:id="31" w:name="Xdfac4f1835c3dd281fdd4b3595fe0c527884be0"/>
+    <w:bookmarkEnd w:id="33"/>
+    <w:bookmarkStart w:id="34" w:name="Xdfac4f1835c3dd281fdd4b3595fe0c527884be0"/>
     <w:p>
       <w:pPr>
         <w:pStyle w:val="Heading3"/>
@@ -4320,8 +4367,8 @@
         <w:t xml:space="preserve">.</w:t>
       </w:r>
     </w:p>
-    <w:bookmarkEnd w:id="31"/>
-    <w:bookmarkStart w:id="32" w:name="X0e5fa54db495d73283be17e4eb071bc772719f2"/>
+    <w:bookmarkEnd w:id="34"/>
+    <w:bookmarkStart w:id="44" w:name="X0e5fa54db495d73283be17e4eb071bc772719f2"/>
     <w:p>
       <w:pPr>
         <w:pStyle w:val="Heading3"/>
@@ -4435,6 +4482,53 @@
     </w:p>
     <w:p>
       <w:pPr>
+        <w:pStyle w:val="BodyText"/>
+      </w:pPr>
+      <w:r>
+        <w:drawing>
+          <wp:inline>
+            <wp:extent cx="5943600" cy="1261664"/>
+            <wp:effectExtent b="0" l="0" r="0" t="0"/>
+            <wp:docPr descr="The pool has allocated 172.19.255.200 and the Service shows it with ipMode VIP — yet curl returns http_code=000" title="" id="36" name="Picture"/>
+            <a:graphic>
+              <a:graphicData uri="http://schemas.openxmlformats.org/drawingml/2006/picture">
+                <pic:pic>
+                  <pic:nvPicPr>
+                    <pic:cNvPr descr="../artifacts/lab-13/screenshots/05-lbipam-allocates-but-does-not-announce.png" id="37" name="Picture"/>
+                    <pic:cNvPicPr>
+                      <a:picLocks noChangeArrowheads="1" noChangeAspect="1"/>
+                    </pic:cNvPicPr>
+                  </pic:nvPicPr>
+                  <pic:blipFill>
+                    <a:blip r:embed="rId35"/>
+                    <a:stretch>
+                      <a:fillRect/>
+                    </a:stretch>
+                  </pic:blipFill>
+                  <pic:spPr bwMode="auto">
+                    <a:xfrm>
+                      <a:off x="0" y="0"/>
+                      <a:ext cx="5943600" cy="1261664"/>
+                    </a:xfrm>
+                    <a:prstGeom prst="rect">
+                      <a:avLst/>
+                    </a:prstGeom>
+                    <a:noFill/>
+                    <a:ln w="9525">
+                      <a:noFill/>
+                      <a:headEnd/>
+                      <a:tailEnd/>
+                    </a:ln>
+                  </pic:spPr>
+                </pic:pic>
+              </a:graphicData>
+            </a:graphic>
+          </wp:inline>
+        </w:drawing>
+      </w:r>
+    </w:p>
+    <w:p>
+      <w:pPr>
         <w:pStyle w:val="SourceCode"/>
       </w:pPr>
       <w:r>
@@ -4623,25 +4717,7 @@
         <w:rPr>
           <w:rStyle w:val="VerbatimChar"/>
         </w:rPr>
-        <w:t xml:space="preserve">cilium-l2announce-default-shopfront         lbipam-control-plane</w:t>
-      </w:r>
-      <w:r>
-        <w:br/>
-      </w:r>
-      <w:r>
-        <w:rPr>
-          <w:rStyle w:val="VerbatimChar"/>
-        </w:rPr>
-        <w:t xml:space="preserve">cilium-l2announce-default-shopfront-fixed   lbipam-control-plane</w:t>
-      </w:r>
-      <w:r>
-        <w:br/>
-      </w:r>
-      <w:r>
-        <w:rPr>
-          <w:rStyle w:val="VerbatimChar"/>
-        </w:rPr>
-        <w:t xml:space="preserve">cilium-l2announce-default-tenant-b          lbipam-control-plane</w:t>
+        <w:t xml:space="preserve">cilium-l2announce-default-shopfront    lbipam-control-plane</w:t>
       </w:r>
       <w:r>
         <w:br/>
@@ -4662,7 +4738,7 @@
         <w:rPr>
           <w:rStyle w:val="VerbatimChar"/>
         </w:rPr>
-        <w:t xml:space="preserve">96:28:36:56:3b:56</w:t>
+        <w:t xml:space="preserve">0e:fb:91:c9:54:e6</w:t>
       </w:r>
       <w:r>
         <w:br/>
@@ -4680,7 +4756,7 @@
         <w:rPr>
           <w:rStyle w:val="VerbatimChar"/>
         </w:rPr>
-        <w:t xml:space="preserve">2a:9c:8d:4b:af:61</w:t>
+        <w:t xml:space="preserve">b6:bb:b3:f9:fe:eb</w:t>
       </w:r>
       <w:r>
         <w:br/>
@@ -4701,16 +4777,16 @@
         <w:rPr>
           <w:rStyle w:val="VerbatimChar"/>
         </w:rPr>
-        <w:t xml:space="preserve">Unicast reply from 172.19.255.200 [96:28:36:56:3B:56]  0.538ms</w:t>
-      </w:r>
-      <w:r>
-        <w:br/>
-      </w:r>
-      <w:r>
-        <w:rPr>
-          <w:rStyle w:val="VerbatimChar"/>
-        </w:rPr>
-        <w:t xml:space="preserve">Unicast reply from 172.19.255.200 [96:28:36:56:3B:56]  0.610ms</w:t>
+        <w:t xml:space="preserve">Unicast reply from 172.19.255.200 [0E:FB:91:C9:54:E6]  0.533ms</w:t>
+      </w:r>
+      <w:r>
+        <w:br/>
+      </w:r>
+      <w:r>
+        <w:rPr>
+          <w:rStyle w:val="VerbatimChar"/>
+        </w:rPr>
+        <w:t xml:space="preserve">Unicast reply from 172.19.255.200 [0E:FB:91:C9:54:E6]  0.569ms</w:t>
       </w:r>
     </w:p>
     <w:p>
@@ -4792,6 +4868,100 @@
         <w:pStyle w:val="BodyText"/>
       </w:pPr>
       <w:r>
+        <w:drawing>
+          <wp:inline>
+            <wp:extent cx="5943600" cy="937467"/>
+            <wp:effectExtent b="0" l="0" r="0" t="0"/>
+            <wp:docPr descr="With the announcement policy in place the same address returns http_code=200, and a Lease appears naming the node that answers" title="" id="39" name="Picture"/>
+            <a:graphic>
+              <a:graphicData uri="http://schemas.openxmlformats.org/drawingml/2006/picture">
+                <pic:pic>
+                  <pic:nvPicPr>
+                    <pic:cNvPr descr="../artifacts/lab-13/screenshots/06-l2-announcement-makes-it-reachable.png" id="40" name="Picture"/>
+                    <pic:cNvPicPr>
+                      <a:picLocks noChangeArrowheads="1" noChangeAspect="1"/>
+                    </pic:cNvPicPr>
+                  </pic:nvPicPr>
+                  <pic:blipFill>
+                    <a:blip r:embed="rId38"/>
+                    <a:stretch>
+                      <a:fillRect/>
+                    </a:stretch>
+                  </pic:blipFill>
+                  <pic:spPr bwMode="auto">
+                    <a:xfrm>
+                      <a:off x="0" y="0"/>
+                      <a:ext cx="5943600" cy="937467"/>
+                    </a:xfrm>
+                    <a:prstGeom prst="rect">
+                      <a:avLst/>
+                    </a:prstGeom>
+                    <a:noFill/>
+                    <a:ln w="9525">
+                      <a:noFill/>
+                      <a:headEnd/>
+                      <a:tailEnd/>
+                    </a:ln>
+                  </pic:spPr>
+                </pic:pic>
+              </a:graphicData>
+            </a:graphic>
+          </wp:inline>
+        </w:drawing>
+      </w:r>
+    </w:p>
+    <w:p>
+      <w:pPr>
+        <w:pStyle w:val="BodyText"/>
+      </w:pPr>
+      <w:r>
+        <w:drawing>
+          <wp:inline>
+            <wp:extent cx="5943600" cy="1180615"/>
+            <wp:effectExtent b="0" l="0" r="0" t="0"/>
+            <wp:docPr descr="The ARP reply comes from 0E:FB:91:C9:54:E6 — the lease holder's eth0, not the worker's" title="" id="42" name="Picture"/>
+            <a:graphic>
+              <a:graphicData uri="http://schemas.openxmlformats.org/drawingml/2006/picture">
+                <pic:pic>
+                  <pic:nvPicPr>
+                    <pic:cNvPr descr="../artifacts/lab-13/screenshots/07-arp-reply-is-the-lease-holder.png" id="43" name="Picture"/>
+                    <pic:cNvPicPr>
+                      <a:picLocks noChangeArrowheads="1" noChangeAspect="1"/>
+                    </pic:cNvPicPr>
+                  </pic:nvPicPr>
+                  <pic:blipFill>
+                    <a:blip r:embed="rId41"/>
+                    <a:stretch>
+                      <a:fillRect/>
+                    </a:stretch>
+                  </pic:blipFill>
+                  <pic:spPr bwMode="auto">
+                    <a:xfrm>
+                      <a:off x="0" y="0"/>
+                      <a:ext cx="5943600" cy="1180615"/>
+                    </a:xfrm>
+                    <a:prstGeom prst="rect">
+                      <a:avLst/>
+                    </a:prstGeom>
+                    <a:noFill/>
+                    <a:ln w="9525">
+                      <a:noFill/>
+                      <a:headEnd/>
+                      <a:tailEnd/>
+                    </a:ln>
+                  </pic:spPr>
+                </pic:pic>
+              </a:graphicData>
+            </a:graphic>
+          </wp:inline>
+        </w:drawing>
+      </w:r>
+    </w:p>
+    <w:p>
+      <w:pPr>
+        <w:pStyle w:val="BodyText"/>
+      </w:pPr>
+      <w:r>
         <w:t xml:space="preserve">The agent exposes what it is announcing:</w:t>
       </w:r>
     </w:p>
@@ -4842,8 +5012,8 @@
         <w:t xml:space="preserve">172.19.255.240   eth0</w:t>
       </w:r>
     </w:p>
-    <w:bookmarkEnd w:id="32"/>
-    <w:bookmarkStart w:id="33" w:name="X7909fae689476c156aab4a7b7ff67a2183da5ae"/>
+    <w:bookmarkEnd w:id="44"/>
+    <w:bookmarkStart w:id="48" w:name="X7909fae689476c156aab4a7b7ff67a2183da5ae"/>
     <w:p>
       <w:pPr>
         <w:pStyle w:val="Heading3"/>
@@ -5529,7 +5699,7 @@
         <w:t xml:space="preserve"> </w:t>
       </w:r>
       <w:r>
-        <w:t xml:space="preserve">Two working, traffic-serving Services lost their external IPs</w:t>
+        <w:t xml:space="preserve">A working, traffic-serving Service lost its external IP</w:t>
       </w:r>
       <w:r>
         <w:t xml:space="preserve"> </w:t>
@@ -5539,28 +5709,43 @@
           <w:b/>
           <w:bCs/>
         </w:rPr>
-        <w:t xml:space="preserve">12 seconds</w:t>
-      </w:r>
-      <w:r>
-        <w:t xml:space="preserve"> </w:t>
-      </w:r>
-      <w:r>
-        <w:t xml:space="preserve">after an edit to a pool, with no warning and no admission rejection. Re-labelling the Services</w:t>
-      </w:r>
-      <w:r>
-        <w:t xml:space="preserve"> </w:t>
-      </w:r>
-      <w:r>
-        <w:rPr>
-          <w:rStyle w:val="VerbatimChar"/>
-        </w:rPr>
-        <w:t xml:space="preserve">tenant=a</w:t>
-      </w:r>
-      <w:r>
-        <w:t xml:space="preserve"> </w:t>
-      </w:r>
-      <w:r>
-        <w:t xml:space="preserve">restored the</w:t>
+        <w:t xml:space="preserve">fourteen seconds</w:t>
+      </w:r>
+      <w:r>
+        <w:t xml:space="preserve"> </w:t>
+      </w:r>
+      <w:r>
+        <w:t xml:space="preserve">after an edit to a pool, with no warning and no admission rejection — the capture below shows the address present, the patch, and</w:t>
+      </w:r>
+      <w:r>
+        <w:t xml:space="preserve"> </w:t>
+      </w:r>
+      <w:r>
+        <w:rPr>
+          <w:rStyle w:val="VerbatimChar"/>
+        </w:rPr>
+        <w:t xml:space="preserve">&lt;pending&gt;</w:t>
+      </w:r>
+      <w:r>
+        <w:t xml:space="preserve"> </w:t>
+      </w:r>
+      <w:r>
+        <w:t xml:space="preserve">with</w:t>
+      </w:r>
+      <w:r>
+        <w:t xml:space="preserve"> </w:t>
+      </w:r>
+      <w:r>
+        <w:rPr>
+          <w:rStyle w:val="VerbatimChar"/>
+        </w:rPr>
+        <w:t xml:space="preserve">reason: no_pool</w:t>
+      </w:r>
+      <w:r>
+        <w:t xml:space="preserve"> </w:t>
+      </w:r>
+      <w:r>
+        <w:t xml:space="preserve">immediately after. Restoring the selector brings the</w:t>
       </w:r>
       <w:r>
         <w:t xml:space="preserve"> </w:t>
@@ -5576,16 +5761,7 @@
         <w:t xml:space="preserve"> </w:t>
       </w:r>
       <w:r>
-        <w:t xml:space="preserve">two addresses and traffic resumed (</w:t>
-      </w:r>
-      <w:r>
-        <w:rPr>
-          <w:rStyle w:val="VerbatimChar"/>
-        </w:rPr>
-        <w:t xml:space="preserve">http_code=200</w:t>
-      </w:r>
-      <w:r>
-        <w:t xml:space="preserve">), but during the gap they were unreachable from outside the cluster. Editing a</w:t>
+        <w:t xml:space="preserve">address back and traffic resumes, but during the gap it is unreachable from outside the cluster. Editing a</w:t>
       </w:r>
       <w:r>
         <w:t xml:space="preserve"> </w:t>
@@ -5603,8 +5779,55 @@
         <w:t xml:space="preserve">selector in production is an outage-class change — treat it like editing a firewall rule, not like adding a label.</w:t>
       </w:r>
     </w:p>
-    <w:bookmarkEnd w:id="33"/>
-    <w:bookmarkStart w:id="34" w:name="X5783bf566a09991f7e845aac3101b50084cb719"/>
+    <w:p>
+      <w:pPr>
+        <w:pStyle w:val="FirstParagraph"/>
+      </w:pPr>
+      <w:r>
+        <w:drawing>
+          <wp:inline>
+            <wp:extent cx="5943600" cy="1180615"/>
+            <wp:effectExtent b="0" l="0" r="0" t="0"/>
+            <wp:docPr descr="A serving Service on 172.19.255.200, one patch to the pool's serviceSelector, and fourteen seconds later it is pending with reason no_pool" title="" id="46" name="Picture"/>
+            <a:graphic>
+              <a:graphicData uri="http://schemas.openxmlformats.org/drawingml/2006/picture">
+                <pic:pic>
+                  <pic:nvPicPr>
+                    <pic:cNvPr descr="../artifacts/lab-13/screenshots/10-narrowing-a-pool-revokes-live-addresses.png" id="47" name="Picture"/>
+                    <pic:cNvPicPr>
+                      <a:picLocks noChangeArrowheads="1" noChangeAspect="1"/>
+                    </pic:cNvPicPr>
+                  </pic:nvPicPr>
+                  <pic:blipFill>
+                    <a:blip r:embed="rId45"/>
+                    <a:stretch>
+                      <a:fillRect/>
+                    </a:stretch>
+                  </pic:blipFill>
+                  <pic:spPr bwMode="auto">
+                    <a:xfrm>
+                      <a:off x="0" y="0"/>
+                      <a:ext cx="5943600" cy="1180615"/>
+                    </a:xfrm>
+                    <a:prstGeom prst="rect">
+                      <a:avLst/>
+                    </a:prstGeom>
+                    <a:noFill/>
+                    <a:ln w="9525">
+                      <a:noFill/>
+                      <a:headEnd/>
+                      <a:tailEnd/>
+                    </a:ln>
+                  </pic:spPr>
+                </pic:pic>
+              </a:graphicData>
+            </a:graphic>
+          </wp:inline>
+        </w:drawing>
+      </w:r>
+    </w:p>
+    <w:bookmarkEnd w:id="48"/>
+    <w:bookmarkStart w:id="55" w:name="X5783bf566a09991f7e845aac3101b50084cb719"/>
     <w:p>
       <w:pPr>
         <w:pStyle w:val="Heading3"/>
@@ -5726,6 +5949,53 @@
       </w:r>
       <w:r>
         <w:t xml:space="preserve">ranges are not flagged for you.</w:t>
+      </w:r>
+    </w:p>
+    <w:p>
+      <w:pPr>
+        <w:pStyle w:val="BodyText"/>
+      </w:pPr>
+      <w:r>
+        <w:drawing>
+          <wp:inline>
+            <wp:extent cx="5943600" cy="937467"/>
+            <wp:effectExtent b="0" l="0" r="0" t="0"/>
+            <wp:docPr descr="The overlapping pool marked CONFLICTING True, with a status message naming both ranges and the pool it clashes with" title="" id="50" name="Picture"/>
+            <a:graphic>
+              <a:graphicData uri="http://schemas.openxmlformats.org/drawingml/2006/picture">
+                <pic:pic>
+                  <pic:nvPicPr>
+                    <pic:cNvPr descr="../artifacts/lab-13/screenshots/08-overlapping-pools-flagged.png" id="51" name="Picture"/>
+                    <pic:cNvPicPr>
+                      <a:picLocks noChangeArrowheads="1" noChangeAspect="1"/>
+                    </pic:cNvPicPr>
+                  </pic:nvPicPr>
+                  <pic:blipFill>
+                    <a:blip r:embed="rId49"/>
+                    <a:stretch>
+                      <a:fillRect/>
+                    </a:stretch>
+                  </pic:blipFill>
+                  <pic:spPr bwMode="auto">
+                    <a:xfrm>
+                      <a:off x="0" y="0"/>
+                      <a:ext cx="5943600" cy="937467"/>
+                    </a:xfrm>
+                    <a:prstGeom prst="rect">
+                      <a:avLst/>
+                    </a:prstGeom>
+                    <a:noFill/>
+                    <a:ln w="9525">
+                      <a:noFill/>
+                      <a:headEnd/>
+                      <a:tailEnd/>
+                    </a:ln>
+                  </pic:spPr>
+                </pic:pic>
+              </a:graphicData>
+            </a:graphic>
+          </wp:inline>
+        </w:drawing>
       </w:r>
     </w:p>
     <w:p>
@@ -5889,8 +6159,55 @@
         <w:t xml:space="preserve">the first thing you run when an LB-IPAM address does not appear.</w:t>
       </w:r>
     </w:p>
-    <w:bookmarkEnd w:id="34"/>
-    <w:bookmarkStart w:id="35" w:name="Xecbae79f0e89421efe4ae9718ea76ffe3b5f6eb"/>
+    <w:p>
+      <w:pPr>
+        <w:pStyle w:val="FirstParagraph"/>
+      </w:pPr>
+      <w:r>
+        <w:drawing>
+          <wp:inline>
+            <wp:extent cx="5943600" cy="1018516"/>
+            <wp:effectExtent b="0" l="0" r="0" t="0"/>
+            <wp:docPr descr="A Service matching no pool: pending, no events at all, and the explanation only on .status.conditions as reason no_pool" title="" id="53" name="Picture"/>
+            <a:graphic>
+              <a:graphicData uri="http://schemas.openxmlformats.org/drawingml/2006/picture">
+                <pic:pic>
+                  <pic:nvPicPr>
+                    <pic:cNvPr descr="../artifacts/lab-13/screenshots/09-unmatched-service-silent.png" id="54" name="Picture"/>
+                    <pic:cNvPicPr>
+                      <a:picLocks noChangeArrowheads="1" noChangeAspect="1"/>
+                    </pic:cNvPicPr>
+                  </pic:nvPicPr>
+                  <pic:blipFill>
+                    <a:blip r:embed="rId52"/>
+                    <a:stretch>
+                      <a:fillRect/>
+                    </a:stretch>
+                  </pic:blipFill>
+                  <pic:spPr bwMode="auto">
+                    <a:xfrm>
+                      <a:off x="0" y="0"/>
+                      <a:ext cx="5943600" cy="1018516"/>
+                    </a:xfrm>
+                    <a:prstGeom prst="rect">
+                      <a:avLst/>
+                    </a:prstGeom>
+                    <a:noFill/>
+                    <a:ln w="9525">
+                      <a:noFill/>
+                      <a:headEnd/>
+                      <a:tailEnd/>
+                    </a:ln>
+                  </pic:spPr>
+                </pic:pic>
+              </a:graphicData>
+            </a:graphic>
+          </wp:inline>
+        </w:drawing>
+      </w:r>
+    </w:p>
+    <w:bookmarkEnd w:id="55"/>
+    <w:bookmarkStart w:id="59" w:name="Xecbae79f0e89421efe4ae9718ea76ffe3b5f6eb"/>
     <w:p>
       <w:pPr>
         <w:pStyle w:val="Heading3"/>
@@ -6006,6 +6323,53 @@
       </w:r>
       <w:r>
         <w:t xml:space="preserve">.</w:t>
+      </w:r>
+    </w:p>
+    <w:p>
+      <w:pPr>
+        <w:pStyle w:val="BodyText"/>
+      </w:pPr>
+      <w:r>
+        <w:drawing>
+          <wp:inline>
+            <wp:extent cx="5943600" cy="937467"/>
+            <wp:effectExtent b="0" l="0" r="0" t="0"/>
+            <wp:docPr descr="enable-bgp-control-plane is empty and no BGP resources are registered at all — ten cilium.io resources, none of them BGP" title="" id="57" name="Picture"/>
+            <a:graphic>
+              <a:graphicData uri="http://schemas.openxmlformats.org/drawingml/2006/picture">
+                <pic:pic>
+                  <pic:nvPicPr>
+                    <pic:cNvPr descr="../artifacts/lab-13/screenshots/11-bgp-is-a-separate-feature.png" id="58" name="Picture"/>
+                    <pic:cNvPicPr>
+                      <a:picLocks noChangeArrowheads="1" noChangeAspect="1"/>
+                    </pic:cNvPicPr>
+                  </pic:nvPicPr>
+                  <pic:blipFill>
+                    <a:blip r:embed="rId56"/>
+                    <a:stretch>
+                      <a:fillRect/>
+                    </a:stretch>
+                  </pic:blipFill>
+                  <pic:spPr bwMode="auto">
+                    <a:xfrm>
+                      <a:off x="0" y="0"/>
+                      <a:ext cx="5943600" cy="937467"/>
+                    </a:xfrm>
+                    <a:prstGeom prst="rect">
+                      <a:avLst/>
+                    </a:prstGeom>
+                    <a:noFill/>
+                    <a:ln w="9525">
+                      <a:noFill/>
+                      <a:headEnd/>
+                      <a:tailEnd/>
+                    </a:ln>
+                  </pic:spPr>
+                </pic:pic>
+              </a:graphicData>
+            </a:graphic>
+          </wp:inline>
+        </w:drawing>
       </w:r>
     </w:p>
     <w:p>
@@ -6234,8 +6598,8 @@
         <w:t xml:space="preserve">The decisive question is usually ownership, not features: if the platform team owns Cilium, one control plane is less to operate; if the network team owns peering and the CNI is chosen elsewhere, MetalLB keeps the boundary clean.</w:t>
       </w:r>
     </w:p>
-    <w:bookmarkEnd w:id="35"/>
-    <w:bookmarkStart w:id="36" w:name="Xc9d505d49ad2470af650411ce42d0fc52c963cf"/>
+    <w:bookmarkEnd w:id="59"/>
+    <w:bookmarkStart w:id="60" w:name="Xc9d505d49ad2470af650411ce42d0fc52c963cf"/>
     <w:p>
       <w:pPr>
         <w:pStyle w:val="Heading3"/>
@@ -6921,8 +7285,8 @@
         <w:t xml:space="preserve">a networking upgrade. You get the same single-node L2 announcement and the same failover behaviour, plus two new sharp edges (announcement must be enabled separately; pool selectors can revoke live addresses).</w:t>
       </w:r>
     </w:p>
-    <w:bookmarkEnd w:id="36"/>
-    <w:bookmarkStart w:id="37" w:name="X8bf96c7149cdb9a678c4aa90b91b21565ecf60d"/>
+    <w:bookmarkEnd w:id="60"/>
+    <w:bookmarkStart w:id="61" w:name="X8bf96c7149cdb9a678c4aa90b91b21565ecf60d"/>
     <w:p>
       <w:pPr>
         <w:pStyle w:val="Heading3"/>
@@ -6967,9 +7331,9 @@
         </w:pict>
       </w:r>
     </w:p>
-    <w:bookmarkEnd w:id="37"/>
-    <w:bookmarkEnd w:id="38"/>
-    <w:bookmarkStart w:id="39" w:name="step-5--clean-up"/>
+    <w:bookmarkEnd w:id="61"/>
+    <w:bookmarkEnd w:id="62"/>
+    <w:bookmarkStart w:id="63" w:name="step-5--clean-up"/>
     <w:p>
       <w:pPr>
         <w:pStyle w:val="Heading2"/>
@@ -7038,8 +7402,8 @@
         </w:pict>
       </w:r>
     </w:p>
-    <w:bookmarkEnd w:id="39"/>
-    <w:bookmarkStart w:id="40" w:name="what-you-learned"/>
+    <w:bookmarkEnd w:id="63"/>
+    <w:bookmarkStart w:id="64" w:name="what-you-learned"/>
     <w:p>
       <w:pPr>
         <w:pStyle w:val="Heading2"/>
@@ -7594,7 +7958,7 @@
               <w:rPr>
                 <w:rStyle w:val="VerbatimChar"/>
               </w:rPr>
-              <w:t xml:space="preserve">96:28:36:56:3B:56</w:t>
+              <w:t xml:space="preserve">0E:FB:91:C9:54:E6</w:t>
             </w:r>
             <w:r>
               <w:t xml:space="preserve"> </w:t>
@@ -7737,7 +8101,7 @@
               <w:pStyle w:val="Compact"/>
             </w:pPr>
             <w:r>
-              <w:t xml:space="preserve">two serving Services →</w:t>
+              <w:t xml:space="preserve">a serving Service →</w:t>
             </w:r>
             <w:r>
               <w:t xml:space="preserve"> </w:t>
@@ -7752,7 +8116,7 @@
               <w:t xml:space="preserve"> </w:t>
             </w:r>
             <w:r>
-              <w:t xml:space="preserve">in 12s,</w:t>
+              <w:t xml:space="preserve">in 14s,</w:t>
             </w:r>
             <w:r>
               <w:t xml:space="preserve"> </w:t>
@@ -7914,8 +8278,8 @@
         </w:tc>
       </w:tr>
     </w:tbl>
-    <w:bookmarkEnd w:id="40"/>
-    <w:bookmarkStart w:id="44" w:name="evidence"/>
+    <w:bookmarkEnd w:id="64"/>
+    <w:bookmarkStart w:id="68" w:name="evidence"/>
     <w:p>
       <w:pPr>
         <w:pStyle w:val="Heading2"/>
@@ -7934,7 +8298,7 @@
       <w:r>
         <w:t xml:space="preserve"> </w:t>
       </w:r>
-      <w:hyperlink r:id="rId41">
+      <w:hyperlink r:id="rId65">
         <w:r>
           <w:rPr>
             <w:rStyle w:val="VerbatimChar"/>
@@ -7951,7 +8315,7 @@
       <w:r>
         <w:t xml:space="preserve"> </w:t>
       </w:r>
-      <w:hyperlink r:id="rId42">
+      <w:hyperlink r:id="rId66">
         <w:r>
           <w:rPr>
             <w:rStyle w:val="VerbatimChar"/>
@@ -8011,7 +8375,7 @@
       <w:r>
         <w:t xml:space="preserve"> </w:t>
       </w:r>
-      <w:hyperlink r:id="rId43">
+      <w:hyperlink r:id="rId67">
         <w:r>
           <w:rPr>
             <w:rStyle w:val="Hyperlink"/>
@@ -8020,7 +8384,7 @@
         </w:r>
       </w:hyperlink>
     </w:p>
-    <w:bookmarkEnd w:id="44"/>
+    <w:bookmarkEnd w:id="68"/>
     <w:sectPr>
       <w:pgSz w:h="15840" w:w="12240"/>
       <w:pgMar w:bottom="1440" w:footer="720" w:gutter="0" w:header="720" w:left="1440" w:right="1440" w:top="1440"/>

</xml_diff>